<commit_message>
Measure Greg's adviser equity pre-Seed; note Ankur's post-Seed as deliberate exception
Greg now matches Sunjay (pre-Seed measurement, diluted by the seed, no
anti-dilution). Ankur remains the sole post-Seed measurement, flagged in
his agreement as intentional and non-precedential.

Co-Authored-By: Claude Opus 5 <noreply@anthropic.com>
Claude-Session: https://claude.ai/code/session_019ajJRqKa1DUy4iKHJKPEi3
</commit_message>
<xml_diff>
--- a/cinderella/legal/Ankur_Jain_Strategic_Adviser_Agreement.docx
+++ b/cinderella/legal/Ankur_Jain_Strategic_Adviser_Agreement.docx
@@ -1668,6 +1668,30 @@
           <w:szCs w:val="22"/>
         </w:rPr>
         <w:t xml:space="preserve">no further anti-dilution protection.</w:t>
+      </w:r>
+      <w:r>
+        <w:rPr>
+          <w:rFonts w:ascii="Times New Roman" w:cs="Times New Roman" w:eastAsia="Times New Roman" w:hAnsi="Times New Roman"/>
+          <w:b w:val="false"/>
+          <w:bCs w:val="false"/>
+          <w:i w:val="false"/>
+          <w:iCs w:val="false"/>
+          <w:sz w:val="22"/>
+          <w:szCs w:val="22"/>
+        </w:rPr>
+        <w:t xml:space="preserve"> </w:t>
+      </w:r>
+      <w:r>
+        <w:rPr>
+          <w:rFonts w:ascii="Times New Roman" w:cs="Times New Roman" w:eastAsia="Times New Roman" w:hAnsi="Times New Roman"/>
+          <w:b w:val="false"/>
+          <w:bCs w:val="false"/>
+          <w:i/>
+          <w:iCs/>
+          <w:sz w:val="22"/>
+          <w:szCs w:val="22"/>
+        </w:rPr>
+        <w:t xml:space="preserve">(Note: this post-Seed measurement is intentionally more favorable than the pre-Seed measurement applied to other equity holders; it is specific to Adviser and is not a precedent for any other grant.)_</w:t>
       </w:r>
     </w:p>
     <w:p>

</xml_diff>